<commit_message>
Finalize CS1105 Unit 1 discussion + save adder circuit
- Discussion: expand truth table to a thorough range with a Result column
  (630 words), confirm design verified across all 16 input combinations,
  update wording to 'built and verified' now that the Logisim circuit works
- Class introduction: add subject line and bold prompt labels
- Save working Logisim circuits (adder.circ = 2-bit adder,
  DiscussionAssignment.circ)
- Regenerate discussion .docx to match
</commit_message>
<xml_diff>
--- a/CS1105_Digital_Electronics_Architecture/Unit1_Introduction_Digital_Design/Discussion/Unit1_Discussion_Post.docx
+++ b/CS1105_Digital_Electronics_Architecture/Unit1_Introduction_Digital_Design/Discussion/Unit1_Discussion_Post.docx
@@ -168,17 +168,18 @@
         <w:tblLook w:firstColumn="1" w:firstRow="1" w:lastColumn="0" w:lastRow="0" w:noHBand="0" w:noVBand="1" w:val="04A0"/>
       </w:tblPr>
       <w:tblGrid>
-        <w:gridCol w:w="1560"/>
-        <w:gridCol w:w="1560"/>
-        <w:gridCol w:w="1560"/>
-        <w:gridCol w:w="1560"/>
-        <w:gridCol w:w="1560"/>
-        <w:gridCol w:w="1560"/>
+        <w:gridCol w:w="1337"/>
+        <w:gridCol w:w="1337"/>
+        <w:gridCol w:w="1337"/>
+        <w:gridCol w:w="1337"/>
+        <w:gridCol w:w="1337"/>
+        <w:gridCol w:w="1337"/>
+        <w:gridCol w:w="1337"/>
       </w:tblGrid>
       <w:tr>
         <w:tc>
           <w:tcPr>
-            <w:tcW w:type="dxa" w:w="1560"/>
+            <w:tcW w:type="dxa" w:w="1337"/>
           </w:tcPr>
           <w:p>
             <w:pPr>
@@ -191,13 +192,13 @@
                 <w:b/>
                 <w:sz w:val="22"/>
               </w:rPr>
-              <w:t>A1A0</w:t>
+              <w:t>A (A1A0)</w:t>
             </w:r>
           </w:p>
         </w:tc>
         <w:tc>
           <w:tcPr>
-            <w:tcW w:type="dxa" w:w="1560"/>
+            <w:tcW w:type="dxa" w:w="1337"/>
           </w:tcPr>
           <w:p>
             <w:pPr>
@@ -210,13 +211,13 @@
                 <w:b/>
                 <w:sz w:val="22"/>
               </w:rPr>
-              <w:t>B1B0</w:t>
+              <w:t>B (B1B0)</w:t>
             </w:r>
           </w:p>
         </w:tc>
         <w:tc>
           <w:tcPr>
-            <w:tcW w:type="dxa" w:w="1560"/>
+            <w:tcW w:type="dxa" w:w="1337"/>
           </w:tcPr>
           <w:p>
             <w:pPr>
@@ -229,13 +230,13 @@
                 <w:b/>
                 <w:sz w:val="22"/>
               </w:rPr>
-              <w:t>Decimal</w:t>
+              <w:t>A + B</w:t>
             </w:r>
           </w:p>
         </w:tc>
         <w:tc>
           <w:tcPr>
-            <w:tcW w:type="dxa" w:w="1560"/>
+            <w:tcW w:type="dxa" w:w="1337"/>
           </w:tcPr>
           <w:p>
             <w:pPr>
@@ -254,7 +255,7 @@
         </w:tc>
         <w:tc>
           <w:tcPr>
-            <w:tcW w:type="dxa" w:w="1560"/>
+            <w:tcW w:type="dxa" w:w="1337"/>
           </w:tcPr>
           <w:p>
             <w:pPr>
@@ -273,7 +274,7 @@
         </w:tc>
         <w:tc>
           <w:tcPr>
-            <w:tcW w:type="dxa" w:w="1560"/>
+            <w:tcW w:type="dxa" w:w="1337"/>
           </w:tcPr>
           <w:p>
             <w:pPr>
@@ -290,11 +291,30 @@
             </w:r>
           </w:p>
         </w:tc>
+        <w:tc>
+          <w:tcPr>
+            <w:tcW w:type="dxa" w:w="1337"/>
+          </w:tcPr>
+          <w:p>
+            <w:pPr>
+              <w:spacing w:line="240" w:lineRule="auto"/>
+            </w:pPr>
+            <w:r/>
+            <w:r>
+              <w:rPr>
+                <w:rFonts w:ascii="Times New Roman" w:hAnsi="Times New Roman"/>
+                <w:b/>
+                <w:sz w:val="22"/>
+              </w:rPr>
+              <w:t>Result</w:t>
+            </w:r>
+          </w:p>
+        </w:tc>
       </w:tr>
       <w:tr>
         <w:tc>
           <w:tcPr>
-            <w:tcW w:type="dxa" w:w="1560"/>
+            <w:tcW w:type="dxa" w:w="1337"/>
           </w:tcPr>
           <w:p>
             <w:pPr>
@@ -306,13 +326,13 @@
                 <w:rFonts w:ascii="Times New Roman" w:hAnsi="Times New Roman"/>
                 <w:sz w:val="22"/>
               </w:rPr>
-              <w:t>00</w:t>
+              <w:t>0 (00)</w:t>
             </w:r>
           </w:p>
         </w:tc>
         <w:tc>
           <w:tcPr>
-            <w:tcW w:type="dxa" w:w="1560"/>
+            <w:tcW w:type="dxa" w:w="1337"/>
           </w:tcPr>
           <w:p>
             <w:pPr>
@@ -324,31 +344,13 @@
                 <w:rFonts w:ascii="Times New Roman" w:hAnsi="Times New Roman"/>
                 <w:sz w:val="22"/>
               </w:rPr>
-              <w:t>00</w:t>
+              <w:t>0 (00)</w:t>
             </w:r>
           </w:p>
         </w:tc>
         <w:tc>
           <w:tcPr>
-            <w:tcW w:type="dxa" w:w="1560"/>
-          </w:tcPr>
-          <w:p>
-            <w:pPr>
-              <w:spacing w:line="240" w:lineRule="auto"/>
-            </w:pPr>
-            <w:r/>
-            <w:r>
-              <w:rPr>
-                <w:rFonts w:ascii="Times New Roman" w:hAnsi="Times New Roman"/>
-                <w:sz w:val="22"/>
-              </w:rPr>
-              <w:t>0+0</w:t>
-            </w:r>
-          </w:p>
-        </w:tc>
-        <w:tc>
-          <w:tcPr>
-            <w:tcW w:type="dxa" w:w="1560"/>
+            <w:tcW w:type="dxa" w:w="1337"/>
           </w:tcPr>
           <w:p>
             <w:pPr>
@@ -366,7 +368,7 @@
         </w:tc>
         <w:tc>
           <w:tcPr>
-            <w:tcW w:type="dxa" w:w="1560"/>
+            <w:tcW w:type="dxa" w:w="1337"/>
           </w:tcPr>
           <w:p>
             <w:pPr>
@@ -384,81 +386,7 @@
         </w:tc>
         <w:tc>
           <w:tcPr>
-            <w:tcW w:type="dxa" w:w="1560"/>
-          </w:tcPr>
-          <w:p>
-            <w:pPr>
-              <w:spacing w:line="240" w:lineRule="auto"/>
-            </w:pPr>
-            <w:r/>
-            <w:r>
-              <w:rPr>
-                <w:rFonts w:ascii="Times New Roman" w:hAnsi="Times New Roman"/>
-                <w:sz w:val="22"/>
-              </w:rPr>
-              <w:t>0</w:t>
-            </w:r>
-          </w:p>
-        </w:tc>
-      </w:tr>
-      <w:tr>
-        <w:tc>
-          <w:tcPr>
-            <w:tcW w:type="dxa" w:w="1560"/>
-          </w:tcPr>
-          <w:p>
-            <w:pPr>
-              <w:spacing w:line="240" w:lineRule="auto"/>
-            </w:pPr>
-            <w:r/>
-            <w:r>
-              <w:rPr>
-                <w:rFonts w:ascii="Times New Roman" w:hAnsi="Times New Roman"/>
-                <w:sz w:val="22"/>
-              </w:rPr>
-              <w:t>01</w:t>
-            </w:r>
-          </w:p>
-        </w:tc>
-        <w:tc>
-          <w:tcPr>
-            <w:tcW w:type="dxa" w:w="1560"/>
-          </w:tcPr>
-          <w:p>
-            <w:pPr>
-              <w:spacing w:line="240" w:lineRule="auto"/>
-            </w:pPr>
-            <w:r/>
-            <w:r>
-              <w:rPr>
-                <w:rFonts w:ascii="Times New Roman" w:hAnsi="Times New Roman"/>
-                <w:sz w:val="22"/>
-              </w:rPr>
-              <w:t>01</w:t>
-            </w:r>
-          </w:p>
-        </w:tc>
-        <w:tc>
-          <w:tcPr>
-            <w:tcW w:type="dxa" w:w="1560"/>
-          </w:tcPr>
-          <w:p>
-            <w:pPr>
-              <w:spacing w:line="240" w:lineRule="auto"/>
-            </w:pPr>
-            <w:r/>
-            <w:r>
-              <w:rPr>
-                <w:rFonts w:ascii="Times New Roman" w:hAnsi="Times New Roman"/>
-                <w:sz w:val="22"/>
-              </w:rPr>
-              <w:t>1+1</w:t>
-            </w:r>
-          </w:p>
-        </w:tc>
-        <w:tc>
-          <w:tcPr>
-            <w:tcW w:type="dxa" w:w="1560"/>
+            <w:tcW w:type="dxa" w:w="1337"/>
           </w:tcPr>
           <w:p>
             <w:pPr>
@@ -476,7 +404,117 @@
         </w:tc>
         <w:tc>
           <w:tcPr>
-            <w:tcW w:type="dxa" w:w="1560"/>
+            <w:tcW w:type="dxa" w:w="1337"/>
+          </w:tcPr>
+          <w:p>
+            <w:pPr>
+              <w:spacing w:line="240" w:lineRule="auto"/>
+            </w:pPr>
+            <w:r/>
+            <w:r>
+              <w:rPr>
+                <w:rFonts w:ascii="Times New Roman" w:hAnsi="Times New Roman"/>
+                <w:sz w:val="22"/>
+              </w:rPr>
+              <w:t>0</w:t>
+            </w:r>
+          </w:p>
+        </w:tc>
+        <w:tc>
+          <w:tcPr>
+            <w:tcW w:type="dxa" w:w="1337"/>
+          </w:tcPr>
+          <w:p>
+            <w:pPr>
+              <w:spacing w:line="240" w:lineRule="auto"/>
+            </w:pPr>
+            <w:r/>
+            <w:r>
+              <w:rPr>
+                <w:rFonts w:ascii="Times New Roman" w:hAnsi="Times New Roman"/>
+                <w:sz w:val="22"/>
+              </w:rPr>
+              <w:t>000 = 0</w:t>
+            </w:r>
+          </w:p>
+        </w:tc>
+      </w:tr>
+      <w:tr>
+        <w:tc>
+          <w:tcPr>
+            <w:tcW w:type="dxa" w:w="1337"/>
+          </w:tcPr>
+          <w:p>
+            <w:pPr>
+              <w:spacing w:line="240" w:lineRule="auto"/>
+            </w:pPr>
+            <w:r/>
+            <w:r>
+              <w:rPr>
+                <w:rFonts w:ascii="Times New Roman" w:hAnsi="Times New Roman"/>
+                <w:sz w:val="22"/>
+              </w:rPr>
+              <w:t>1 (01)</w:t>
+            </w:r>
+          </w:p>
+        </w:tc>
+        <w:tc>
+          <w:tcPr>
+            <w:tcW w:type="dxa" w:w="1337"/>
+          </w:tcPr>
+          <w:p>
+            <w:pPr>
+              <w:spacing w:line="240" w:lineRule="auto"/>
+            </w:pPr>
+            <w:r/>
+            <w:r>
+              <w:rPr>
+                <w:rFonts w:ascii="Times New Roman" w:hAnsi="Times New Roman"/>
+                <w:sz w:val="22"/>
+              </w:rPr>
+              <w:t>1 (01)</w:t>
+            </w:r>
+          </w:p>
+        </w:tc>
+        <w:tc>
+          <w:tcPr>
+            <w:tcW w:type="dxa" w:w="1337"/>
+          </w:tcPr>
+          <w:p>
+            <w:pPr>
+              <w:spacing w:line="240" w:lineRule="auto"/>
+            </w:pPr>
+            <w:r/>
+            <w:r>
+              <w:rPr>
+                <w:rFonts w:ascii="Times New Roman" w:hAnsi="Times New Roman"/>
+                <w:sz w:val="22"/>
+              </w:rPr>
+              <w:t>2</w:t>
+            </w:r>
+          </w:p>
+        </w:tc>
+        <w:tc>
+          <w:tcPr>
+            <w:tcW w:type="dxa" w:w="1337"/>
+          </w:tcPr>
+          <w:p>
+            <w:pPr>
+              <w:spacing w:line="240" w:lineRule="auto"/>
+            </w:pPr>
+            <w:r/>
+            <w:r>
+              <w:rPr>
+                <w:rFonts w:ascii="Times New Roman" w:hAnsi="Times New Roman"/>
+                <w:sz w:val="22"/>
+              </w:rPr>
+              <w:t>0</w:t>
+            </w:r>
+          </w:p>
+        </w:tc>
+        <w:tc>
+          <w:tcPr>
+            <w:tcW w:type="dxa" w:w="1337"/>
           </w:tcPr>
           <w:p>
             <w:pPr>
@@ -494,81 +532,7 @@
         </w:tc>
         <w:tc>
           <w:tcPr>
-            <w:tcW w:type="dxa" w:w="1560"/>
-          </w:tcPr>
-          <w:p>
-            <w:pPr>
-              <w:spacing w:line="240" w:lineRule="auto"/>
-            </w:pPr>
-            <w:r/>
-            <w:r>
-              <w:rPr>
-                <w:rFonts w:ascii="Times New Roman" w:hAnsi="Times New Roman"/>
-                <w:sz w:val="22"/>
-              </w:rPr>
-              <w:t>0</w:t>
-            </w:r>
-          </w:p>
-        </w:tc>
-      </w:tr>
-      <w:tr>
-        <w:tc>
-          <w:tcPr>
-            <w:tcW w:type="dxa" w:w="1560"/>
-          </w:tcPr>
-          <w:p>
-            <w:pPr>
-              <w:spacing w:line="240" w:lineRule="auto"/>
-            </w:pPr>
-            <w:r/>
-            <w:r>
-              <w:rPr>
-                <w:rFonts w:ascii="Times New Roman" w:hAnsi="Times New Roman"/>
-                <w:sz w:val="22"/>
-              </w:rPr>
-              <w:t>10</w:t>
-            </w:r>
-          </w:p>
-        </w:tc>
-        <w:tc>
-          <w:tcPr>
-            <w:tcW w:type="dxa" w:w="1560"/>
-          </w:tcPr>
-          <w:p>
-            <w:pPr>
-              <w:spacing w:line="240" w:lineRule="auto"/>
-            </w:pPr>
-            <w:r/>
-            <w:r>
-              <w:rPr>
-                <w:rFonts w:ascii="Times New Roman" w:hAnsi="Times New Roman"/>
-                <w:sz w:val="22"/>
-              </w:rPr>
-              <w:t>01</w:t>
-            </w:r>
-          </w:p>
-        </w:tc>
-        <w:tc>
-          <w:tcPr>
-            <w:tcW w:type="dxa" w:w="1560"/>
-          </w:tcPr>
-          <w:p>
-            <w:pPr>
-              <w:spacing w:line="240" w:lineRule="auto"/>
-            </w:pPr>
-            <w:r/>
-            <w:r>
-              <w:rPr>
-                <w:rFonts w:ascii="Times New Roman" w:hAnsi="Times New Roman"/>
-                <w:sz w:val="22"/>
-              </w:rPr>
-              <w:t>2+1</w:t>
-            </w:r>
-          </w:p>
-        </w:tc>
-        <w:tc>
-          <w:tcPr>
-            <w:tcW w:type="dxa" w:w="1560"/>
+            <w:tcW w:type="dxa" w:w="1337"/>
           </w:tcPr>
           <w:p>
             <w:pPr>
@@ -586,7 +550,99 @@
         </w:tc>
         <w:tc>
           <w:tcPr>
-            <w:tcW w:type="dxa" w:w="1560"/>
+            <w:tcW w:type="dxa" w:w="1337"/>
+          </w:tcPr>
+          <w:p>
+            <w:pPr>
+              <w:spacing w:line="240" w:lineRule="auto"/>
+            </w:pPr>
+            <w:r/>
+            <w:r>
+              <w:rPr>
+                <w:rFonts w:ascii="Times New Roman" w:hAnsi="Times New Roman"/>
+                <w:sz w:val="22"/>
+              </w:rPr>
+              <w:t>010 = 2</w:t>
+            </w:r>
+          </w:p>
+        </w:tc>
+      </w:tr>
+      <w:tr>
+        <w:tc>
+          <w:tcPr>
+            <w:tcW w:type="dxa" w:w="1337"/>
+          </w:tcPr>
+          <w:p>
+            <w:pPr>
+              <w:spacing w:line="240" w:lineRule="auto"/>
+            </w:pPr>
+            <w:r/>
+            <w:r>
+              <w:rPr>
+                <w:rFonts w:ascii="Times New Roman" w:hAnsi="Times New Roman"/>
+                <w:sz w:val="22"/>
+              </w:rPr>
+              <w:t>2 (10)</w:t>
+            </w:r>
+          </w:p>
+        </w:tc>
+        <w:tc>
+          <w:tcPr>
+            <w:tcW w:type="dxa" w:w="1337"/>
+          </w:tcPr>
+          <w:p>
+            <w:pPr>
+              <w:spacing w:line="240" w:lineRule="auto"/>
+            </w:pPr>
+            <w:r/>
+            <w:r>
+              <w:rPr>
+                <w:rFonts w:ascii="Times New Roman" w:hAnsi="Times New Roman"/>
+                <w:sz w:val="22"/>
+              </w:rPr>
+              <w:t>1 (01)</w:t>
+            </w:r>
+          </w:p>
+        </w:tc>
+        <w:tc>
+          <w:tcPr>
+            <w:tcW w:type="dxa" w:w="1337"/>
+          </w:tcPr>
+          <w:p>
+            <w:pPr>
+              <w:spacing w:line="240" w:lineRule="auto"/>
+            </w:pPr>
+            <w:r/>
+            <w:r>
+              <w:rPr>
+                <w:rFonts w:ascii="Times New Roman" w:hAnsi="Times New Roman"/>
+                <w:sz w:val="22"/>
+              </w:rPr>
+              <w:t>3</w:t>
+            </w:r>
+          </w:p>
+        </w:tc>
+        <w:tc>
+          <w:tcPr>
+            <w:tcW w:type="dxa" w:w="1337"/>
+          </w:tcPr>
+          <w:p>
+            <w:pPr>
+              <w:spacing w:line="240" w:lineRule="auto"/>
+            </w:pPr>
+            <w:r/>
+            <w:r>
+              <w:rPr>
+                <w:rFonts w:ascii="Times New Roman" w:hAnsi="Times New Roman"/>
+                <w:sz w:val="22"/>
+              </w:rPr>
+              <w:t>0</w:t>
+            </w:r>
+          </w:p>
+        </w:tc>
+        <w:tc>
+          <w:tcPr>
+            <w:tcW w:type="dxa" w:w="1337"/>
           </w:tcPr>
           <w:p>
             <w:pPr>
@@ -604,81 +660,7 @@
         </w:tc>
         <w:tc>
           <w:tcPr>
-            <w:tcW w:type="dxa" w:w="1560"/>
-          </w:tcPr>
-          <w:p>
-            <w:pPr>
-              <w:spacing w:line="240" w:lineRule="auto"/>
-            </w:pPr>
-            <w:r/>
-            <w:r>
-              <w:rPr>
-                <w:rFonts w:ascii="Times New Roman" w:hAnsi="Times New Roman"/>
-                <w:sz w:val="22"/>
-              </w:rPr>
-              <w:t>1</w:t>
-            </w:r>
-          </w:p>
-        </w:tc>
-      </w:tr>
-      <w:tr>
-        <w:tc>
-          <w:tcPr>
-            <w:tcW w:type="dxa" w:w="1560"/>
-          </w:tcPr>
-          <w:p>
-            <w:pPr>
-              <w:spacing w:line="240" w:lineRule="auto"/>
-            </w:pPr>
-            <w:r/>
-            <w:r>
-              <w:rPr>
-                <w:rFonts w:ascii="Times New Roman" w:hAnsi="Times New Roman"/>
-                <w:sz w:val="22"/>
-              </w:rPr>
-              <w:t>11</w:t>
-            </w:r>
-          </w:p>
-        </w:tc>
-        <w:tc>
-          <w:tcPr>
-            <w:tcW w:type="dxa" w:w="1560"/>
-          </w:tcPr>
-          <w:p>
-            <w:pPr>
-              <w:spacing w:line="240" w:lineRule="auto"/>
-            </w:pPr>
-            <w:r/>
-            <w:r>
-              <w:rPr>
-                <w:rFonts w:ascii="Times New Roman" w:hAnsi="Times New Roman"/>
-                <w:sz w:val="22"/>
-              </w:rPr>
-              <w:t>01</w:t>
-            </w:r>
-          </w:p>
-        </w:tc>
-        <w:tc>
-          <w:tcPr>
-            <w:tcW w:type="dxa" w:w="1560"/>
-          </w:tcPr>
-          <w:p>
-            <w:pPr>
-              <w:spacing w:line="240" w:lineRule="auto"/>
-            </w:pPr>
-            <w:r/>
-            <w:r>
-              <w:rPr>
-                <w:rFonts w:ascii="Times New Roman" w:hAnsi="Times New Roman"/>
-                <w:sz w:val="22"/>
-              </w:rPr>
-              <w:t>3+1</w:t>
-            </w:r>
-          </w:p>
-        </w:tc>
-        <w:tc>
-          <w:tcPr>
-            <w:tcW w:type="dxa" w:w="1560"/>
+            <w:tcW w:type="dxa" w:w="1337"/>
           </w:tcPr>
           <w:p>
             <w:pPr>
@@ -696,7 +678,99 @@
         </w:tc>
         <w:tc>
           <w:tcPr>
-            <w:tcW w:type="dxa" w:w="1560"/>
+            <w:tcW w:type="dxa" w:w="1337"/>
+          </w:tcPr>
+          <w:p>
+            <w:pPr>
+              <w:spacing w:line="240" w:lineRule="auto"/>
+            </w:pPr>
+            <w:r/>
+            <w:r>
+              <w:rPr>
+                <w:rFonts w:ascii="Times New Roman" w:hAnsi="Times New Roman"/>
+                <w:sz w:val="22"/>
+              </w:rPr>
+              <w:t>011 = 3</w:t>
+            </w:r>
+          </w:p>
+        </w:tc>
+      </w:tr>
+      <w:tr>
+        <w:tc>
+          <w:tcPr>
+            <w:tcW w:type="dxa" w:w="1337"/>
+          </w:tcPr>
+          <w:p>
+            <w:pPr>
+              <w:spacing w:line="240" w:lineRule="auto"/>
+            </w:pPr>
+            <w:r/>
+            <w:r>
+              <w:rPr>
+                <w:rFonts w:ascii="Times New Roman" w:hAnsi="Times New Roman"/>
+                <w:sz w:val="22"/>
+              </w:rPr>
+              <w:t>3 (11)</w:t>
+            </w:r>
+          </w:p>
+        </w:tc>
+        <w:tc>
+          <w:tcPr>
+            <w:tcW w:type="dxa" w:w="1337"/>
+          </w:tcPr>
+          <w:p>
+            <w:pPr>
+              <w:spacing w:line="240" w:lineRule="auto"/>
+            </w:pPr>
+            <w:r/>
+            <w:r>
+              <w:rPr>
+                <w:rFonts w:ascii="Times New Roman" w:hAnsi="Times New Roman"/>
+                <w:sz w:val="22"/>
+              </w:rPr>
+              <w:t>1 (01)</w:t>
+            </w:r>
+          </w:p>
+        </w:tc>
+        <w:tc>
+          <w:tcPr>
+            <w:tcW w:type="dxa" w:w="1337"/>
+          </w:tcPr>
+          <w:p>
+            <w:pPr>
+              <w:spacing w:line="240" w:lineRule="auto"/>
+            </w:pPr>
+            <w:r/>
+            <w:r>
+              <w:rPr>
+                <w:rFonts w:ascii="Times New Roman" w:hAnsi="Times New Roman"/>
+                <w:sz w:val="22"/>
+              </w:rPr>
+              <w:t>4</w:t>
+            </w:r>
+          </w:p>
+        </w:tc>
+        <w:tc>
+          <w:tcPr>
+            <w:tcW w:type="dxa" w:w="1337"/>
+          </w:tcPr>
+          <w:p>
+            <w:pPr>
+              <w:spacing w:line="240" w:lineRule="auto"/>
+            </w:pPr>
+            <w:r/>
+            <w:r>
+              <w:rPr>
+                <w:rFonts w:ascii="Times New Roman" w:hAnsi="Times New Roman"/>
+                <w:sz w:val="22"/>
+              </w:rPr>
+              <w:t>1</w:t>
+            </w:r>
+          </w:p>
+        </w:tc>
+        <w:tc>
+          <w:tcPr>
+            <w:tcW w:type="dxa" w:w="1337"/>
           </w:tcPr>
           <w:p>
             <w:pPr>
@@ -714,7 +788,7 @@
         </w:tc>
         <w:tc>
           <w:tcPr>
-            <w:tcW w:type="dxa" w:w="1560"/>
+            <w:tcW w:type="dxa" w:w="1337"/>
           </w:tcPr>
           <w:p>
             <w:pPr>
@@ -730,11 +804,9 @@
             </w:r>
           </w:p>
         </w:tc>
-      </w:tr>
-      <w:tr>
         <w:tc>
           <w:tcPr>
-            <w:tcW w:type="dxa" w:w="1560"/>
+            <w:tcW w:type="dxa" w:w="1337"/>
           </w:tcPr>
           <w:p>
             <w:pPr>
@@ -746,13 +818,15 @@
                 <w:rFonts w:ascii="Times New Roman" w:hAnsi="Times New Roman"/>
                 <w:sz w:val="22"/>
               </w:rPr>
-              <w:t>10</w:t>
+              <w:t>100 = 4</w:t>
             </w:r>
           </w:p>
         </w:tc>
+      </w:tr>
+      <w:tr>
         <w:tc>
           <w:tcPr>
-            <w:tcW w:type="dxa" w:w="1560"/>
+            <w:tcW w:type="dxa" w:w="1337"/>
           </w:tcPr>
           <w:p>
             <w:pPr>
@@ -764,13 +838,13 @@
                 <w:rFonts w:ascii="Times New Roman" w:hAnsi="Times New Roman"/>
                 <w:sz w:val="22"/>
               </w:rPr>
-              <w:t>10</w:t>
+              <w:t>2 (10)</w:t>
             </w:r>
           </w:p>
         </w:tc>
         <w:tc>
           <w:tcPr>
-            <w:tcW w:type="dxa" w:w="1560"/>
+            <w:tcW w:type="dxa" w:w="1337"/>
           </w:tcPr>
           <w:p>
             <w:pPr>
@@ -782,13 +856,31 @@
                 <w:rFonts w:ascii="Times New Roman" w:hAnsi="Times New Roman"/>
                 <w:sz w:val="22"/>
               </w:rPr>
-              <w:t>2+2</w:t>
+              <w:t>2 (10)</w:t>
             </w:r>
           </w:p>
         </w:tc>
         <w:tc>
           <w:tcPr>
-            <w:tcW w:type="dxa" w:w="1560"/>
+            <w:tcW w:type="dxa" w:w="1337"/>
+          </w:tcPr>
+          <w:p>
+            <w:pPr>
+              <w:spacing w:line="240" w:lineRule="auto"/>
+            </w:pPr>
+            <w:r/>
+            <w:r>
+              <w:rPr>
+                <w:rFonts w:ascii="Times New Roman" w:hAnsi="Times New Roman"/>
+                <w:sz w:val="22"/>
+              </w:rPr>
+              <w:t>4</w:t>
+            </w:r>
+          </w:p>
+        </w:tc>
+        <w:tc>
+          <w:tcPr>
+            <w:tcW w:type="dxa" w:w="1337"/>
           </w:tcPr>
           <w:p>
             <w:pPr>
@@ -806,7 +898,7 @@
         </w:tc>
         <w:tc>
           <w:tcPr>
-            <w:tcW w:type="dxa" w:w="1560"/>
+            <w:tcW w:type="dxa" w:w="1337"/>
           </w:tcPr>
           <w:p>
             <w:pPr>
@@ -824,7 +916,7 @@
         </w:tc>
         <w:tc>
           <w:tcPr>
-            <w:tcW w:type="dxa" w:w="1560"/>
+            <w:tcW w:type="dxa" w:w="1337"/>
           </w:tcPr>
           <w:p>
             <w:pPr>
@@ -840,11 +932,9 @@
             </w:r>
           </w:p>
         </w:tc>
-      </w:tr>
-      <w:tr>
         <w:tc>
           <w:tcPr>
-            <w:tcW w:type="dxa" w:w="1560"/>
+            <w:tcW w:type="dxa" w:w="1337"/>
           </w:tcPr>
           <w:p>
             <w:pPr>
@@ -856,13 +946,15 @@
                 <w:rFonts w:ascii="Times New Roman" w:hAnsi="Times New Roman"/>
                 <w:sz w:val="22"/>
               </w:rPr>
-              <w:t>11</w:t>
+              <w:t>100 = 4</w:t>
             </w:r>
           </w:p>
         </w:tc>
+      </w:tr>
+      <w:tr>
         <w:tc>
           <w:tcPr>
-            <w:tcW w:type="dxa" w:w="1560"/>
+            <w:tcW w:type="dxa" w:w="1337"/>
           </w:tcPr>
           <w:p>
             <w:pPr>
@@ -874,13 +966,13 @@
                 <w:rFonts w:ascii="Times New Roman" w:hAnsi="Times New Roman"/>
                 <w:sz w:val="22"/>
               </w:rPr>
-              <w:t>11</w:t>
+              <w:t>2 (10)</w:t>
             </w:r>
           </w:p>
         </w:tc>
         <w:tc>
           <w:tcPr>
-            <w:tcW w:type="dxa" w:w="1560"/>
+            <w:tcW w:type="dxa" w:w="1337"/>
           </w:tcPr>
           <w:p>
             <w:pPr>
@@ -892,13 +984,31 @@
                 <w:rFonts w:ascii="Times New Roman" w:hAnsi="Times New Roman"/>
                 <w:sz w:val="22"/>
               </w:rPr>
-              <w:t>3+3</w:t>
+              <w:t>3 (11)</w:t>
             </w:r>
           </w:p>
         </w:tc>
         <w:tc>
           <w:tcPr>
-            <w:tcW w:type="dxa" w:w="1560"/>
+            <w:tcW w:type="dxa" w:w="1337"/>
+          </w:tcPr>
+          <w:p>
+            <w:pPr>
+              <w:spacing w:line="240" w:lineRule="auto"/>
+            </w:pPr>
+            <w:r/>
+            <w:r>
+              <w:rPr>
+                <w:rFonts w:ascii="Times New Roman" w:hAnsi="Times New Roman"/>
+                <w:sz w:val="22"/>
+              </w:rPr>
+              <w:t>5</w:t>
+            </w:r>
+          </w:p>
+        </w:tc>
+        <w:tc>
+          <w:tcPr>
+            <w:tcW w:type="dxa" w:w="1337"/>
           </w:tcPr>
           <w:p>
             <w:pPr>
@@ -916,7 +1026,25 @@
         </w:tc>
         <w:tc>
           <w:tcPr>
-            <w:tcW w:type="dxa" w:w="1560"/>
+            <w:tcW w:type="dxa" w:w="1337"/>
+          </w:tcPr>
+          <w:p>
+            <w:pPr>
+              <w:spacing w:line="240" w:lineRule="auto"/>
+            </w:pPr>
+            <w:r/>
+            <w:r>
+              <w:rPr>
+                <w:rFonts w:ascii="Times New Roman" w:hAnsi="Times New Roman"/>
+                <w:sz w:val="22"/>
+              </w:rPr>
+              <w:t>0</w:t>
+            </w:r>
+          </w:p>
+        </w:tc>
+        <w:tc>
+          <w:tcPr>
+            <w:tcW w:type="dxa" w:w="1337"/>
           </w:tcPr>
           <w:p>
             <w:pPr>
@@ -934,7 +1062,117 @@
         </w:tc>
         <w:tc>
           <w:tcPr>
-            <w:tcW w:type="dxa" w:w="1560"/>
+            <w:tcW w:type="dxa" w:w="1337"/>
+          </w:tcPr>
+          <w:p>
+            <w:pPr>
+              <w:spacing w:line="240" w:lineRule="auto"/>
+            </w:pPr>
+            <w:r/>
+            <w:r>
+              <w:rPr>
+                <w:rFonts w:ascii="Times New Roman" w:hAnsi="Times New Roman"/>
+                <w:sz w:val="22"/>
+              </w:rPr>
+              <w:t>101 = 5</w:t>
+            </w:r>
+          </w:p>
+        </w:tc>
+      </w:tr>
+      <w:tr>
+        <w:tc>
+          <w:tcPr>
+            <w:tcW w:type="dxa" w:w="1337"/>
+          </w:tcPr>
+          <w:p>
+            <w:pPr>
+              <w:spacing w:line="240" w:lineRule="auto"/>
+            </w:pPr>
+            <w:r/>
+            <w:r>
+              <w:rPr>
+                <w:rFonts w:ascii="Times New Roman" w:hAnsi="Times New Roman"/>
+                <w:sz w:val="22"/>
+              </w:rPr>
+              <w:t>3 (11)</w:t>
+            </w:r>
+          </w:p>
+        </w:tc>
+        <w:tc>
+          <w:tcPr>
+            <w:tcW w:type="dxa" w:w="1337"/>
+          </w:tcPr>
+          <w:p>
+            <w:pPr>
+              <w:spacing w:line="240" w:lineRule="auto"/>
+            </w:pPr>
+            <w:r/>
+            <w:r>
+              <w:rPr>
+                <w:rFonts w:ascii="Times New Roman" w:hAnsi="Times New Roman"/>
+                <w:sz w:val="22"/>
+              </w:rPr>
+              <w:t>3 (11)</w:t>
+            </w:r>
+          </w:p>
+        </w:tc>
+        <w:tc>
+          <w:tcPr>
+            <w:tcW w:type="dxa" w:w="1337"/>
+          </w:tcPr>
+          <w:p>
+            <w:pPr>
+              <w:spacing w:line="240" w:lineRule="auto"/>
+            </w:pPr>
+            <w:r/>
+            <w:r>
+              <w:rPr>
+                <w:rFonts w:ascii="Times New Roman" w:hAnsi="Times New Roman"/>
+                <w:sz w:val="22"/>
+              </w:rPr>
+              <w:t>6</w:t>
+            </w:r>
+          </w:p>
+        </w:tc>
+        <w:tc>
+          <w:tcPr>
+            <w:tcW w:type="dxa" w:w="1337"/>
+          </w:tcPr>
+          <w:p>
+            <w:pPr>
+              <w:spacing w:line="240" w:lineRule="auto"/>
+            </w:pPr>
+            <w:r/>
+            <w:r>
+              <w:rPr>
+                <w:rFonts w:ascii="Times New Roman" w:hAnsi="Times New Roman"/>
+                <w:sz w:val="22"/>
+              </w:rPr>
+              <w:t>1</w:t>
+            </w:r>
+          </w:p>
+        </w:tc>
+        <w:tc>
+          <w:tcPr>
+            <w:tcW w:type="dxa" w:w="1337"/>
+          </w:tcPr>
+          <w:p>
+            <w:pPr>
+              <w:spacing w:line="240" w:lineRule="auto"/>
+            </w:pPr>
+            <w:r/>
+            <w:r>
+              <w:rPr>
+                <w:rFonts w:ascii="Times New Roman" w:hAnsi="Times New Roman"/>
+                <w:sz w:val="22"/>
+              </w:rPr>
+              <w:t>1</w:t>
+            </w:r>
+          </w:p>
+        </w:tc>
+        <w:tc>
+          <w:tcPr>
+            <w:tcW w:type="dxa" w:w="1337"/>
           </w:tcPr>
           <w:p>
             <w:pPr>
@@ -947,6 +1185,24 @@
                 <w:sz w:val="22"/>
               </w:rPr>
               <w:t>0</w:t>
+            </w:r>
+          </w:p>
+        </w:tc>
+        <w:tc>
+          <w:tcPr>
+            <w:tcW w:type="dxa" w:w="1337"/>
+          </w:tcPr>
+          <w:p>
+            <w:pPr>
+              <w:spacing w:line="240" w:lineRule="auto"/>
+            </w:pPr>
+            <w:r/>
+            <w:r>
+              <w:rPr>
+                <w:rFonts w:ascii="Times New Roman" w:hAnsi="Times New Roman"/>
+                <w:sz w:val="22"/>
+              </w:rPr>
+              <w:t>110 = 6</w:t>
             </w:r>
           </w:p>
         </w:tc>
@@ -1020,7 +1276,7 @@
           <w:b w:val="0"/>
           <w:sz w:val="24"/>
         </w:rPr>
-        <w:t>Categorizing outcomes by binary arithmetic rules, the circuit shows three cases: additions with no carry (small sums such as 1 + 1 = 010), additions that generate an internal carry from bit 0 into bit 1, and additions large enough to overflow two bits and set Cout (such as 2 + 2 and 3 + 3). Because the outputs depend only on the current inputs and not on stored state, this is a purely combinational circuit (Ndjountche, 2016). I plan to build and verify this design in Logisim, confirming each truth-table row by toggling the input pins.</w:t>
+        <w:t>Categorizing outcomes by binary arithmetic rules, the circuit shows three cases: additions with no carry (small sums such as 1 + 1 = 010), additions that generate an internal carry from bit 0 into bit 1, and additions large enough to overflow two bits and set Cout (such as 2 + 2 and 3 + 3). Because the outputs depend only on the current inputs and not on stored state, this is a purely combinational circuit (Ndjountche, 2016). I built and verified this design in Logisim, confirming each truth-table row by toggling the input pins; the circuit diagram is included below.</w:t>
       </w:r>
     </w:p>
     <w:p>

</xml_diff>